<commit_message>
Update CBM test fixtures for parser bug fixes
Regenerate fixture documents to match real CBM document structure:
- MN-INTAKE uses List Paragraph style for workflow steps (Bug #2)
- MN-INTAKE uses ID/Requirement table for requirements (Bug #1)
- Entity Inventory includes a decoy detail table (Bug #3 regression)
- create_fixtures.py updated to generate the new fixture format

Co-Authored-By: Claude Opus 4.6 (1M context) <noreply@anthropic.com>
</commit_message>
<xml_diff>
--- a/automation/tests/fixtures/cbm_subset/CBM-Entity-Inventory.docx
+++ b/automation/tests/fixtures/cbm_subset/CBM-Entity-Inventory.docx
@@ -231,6 +231,82 @@
           <w:p>
             <w:r>
               <w:t>Custom</w:t>
+            </w:r>
+          </w:p>
+        </w:tc>
+      </w:tr>
+    </w:tbl>
+    <w:tbl>
+      <w:tblPr>
+        <w:tblW w:type="auto" w:w="0"/>
+        <w:tblLook w:firstColumn="1" w:firstRow="1" w:lastColumn="0" w:lastRow="0" w:noHBand="0" w:noVBand="1" w:val="04A0"/>
+      </w:tblPr>
+      <w:tblGrid>
+        <w:gridCol w:w="4320"/>
+        <w:gridCol w:w="4320"/>
+      </w:tblGrid>
+      <w:tr>
+        <w:tc>
+          <w:tcPr>
+            <w:tcW w:type="dxa" w:w="4320"/>
+          </w:tcPr>
+          <w:p>
+            <w:r>
+              <w:t>Entity Type</w:t>
+            </w:r>
+          </w:p>
+        </w:tc>
+        <w:tc>
+          <w:tcPr>
+            <w:tcW w:type="dxa" w:w="4320"/>
+          </w:tcPr>
+          <w:p>
+            <w:r>
+              <w:t>Person</w:t>
+            </w:r>
+          </w:p>
+        </w:tc>
+      </w:tr>
+      <w:tr>
+        <w:tc>
+          <w:tcPr>
+            <w:tcW w:type="dxa" w:w="4320"/>
+          </w:tcPr>
+          <w:p>
+            <w:r>
+              <w:t>Display Name</w:t>
+            </w:r>
+          </w:p>
+        </w:tc>
+        <w:tc>
+          <w:tcPr>
+            <w:tcW w:type="dxa" w:w="4320"/>
+          </w:tcPr>
+          <w:p>
+            <w:r>
+              <w:t>Contact</w:t>
+            </w:r>
+          </w:p>
+        </w:tc>
+      </w:tr>
+      <w:tr>
+        <w:tc>
+          <w:tcPr>
+            <w:tcW w:type="dxa" w:w="4320"/>
+          </w:tcPr>
+          <w:p>
+            <w:r>
+              <w:t>Activity Stream</w:t>
+            </w:r>
+          </w:p>
+        </w:tc>
+        <w:tc>
+          <w:tcPr>
+            <w:tcW w:type="dxa" w:w="4320"/>
+          </w:tcPr>
+          <w:p>
+            <w:r>
+              <w:t>Yes</w:t>
             </w:r>
           </w:p>
         </w:tc>

</xml_diff>